<commit_message>
Moved report to markdown. Finsihed Step 1 table, working on step 2 following Lab 3 as guidance
</commit_message>
<xml_diff>
--- a/report/OOAD - CA1.docx
+++ b/report/OOAD - CA1.docx
@@ -116,14 +116,30 @@
             <w:pPr>
               <w:spacing w:line="276" w:lineRule="auto"/>
               <w:jc w:val="center"/>
-            </w:pPr>
-            <w:r>
+              <w:rPr>
+                <w:b/>
+                <w:bCs/>
+              </w:rPr>
+            </w:pPr>
+            <w:r>
+              <w:rPr>
+                <w:b/>
+                <w:bCs/>
+              </w:rPr>
               <w:t>S1</w:t>
             </w:r>
             <w:r>
+              <w:rPr>
+                <w:b/>
+                <w:bCs/>
+              </w:rPr>
               <w:t xml:space="preserve"> </w:t>
             </w:r>
             <w:r>
+              <w:rPr>
+                <w:b/>
+                <w:bCs/>
+              </w:rPr>
               <w:t>L1</w:t>
             </w:r>
           </w:p>
@@ -167,7 +183,13 @@
               <w:spacing w:line="276" w:lineRule="auto"/>
             </w:pPr>
             <w:r>
-              <w:t>The service handles serval media types from two kinds of contributors (Individuals &amp; local organisations), so the service has to handle various files and sources.</w:t>
+              <w:t>The service handles se</w:t>
+            </w:r>
+            <w:r>
+              <w:t>veral</w:t>
+            </w:r>
+            <w:r>
+              <w:t xml:space="preserve"> media types from two kinds of contributors (Individuals &amp; local organisations), so the service has to handle various files and sources</w:t>
             </w:r>
           </w:p>
         </w:tc>
@@ -181,8 +203,16 @@
             <w:pPr>
               <w:spacing w:line="276" w:lineRule="auto"/>
               <w:jc w:val="center"/>
-            </w:pPr>
-            <w:r>
+              <w:rPr>
+                <w:b/>
+                <w:bCs/>
+              </w:rPr>
+            </w:pPr>
+            <w:r>
+              <w:rPr>
+                <w:b/>
+                <w:bCs/>
+              </w:rPr>
               <w:t>S1 L2</w:t>
             </w:r>
           </w:p>
@@ -238,8 +268,16 @@
             <w:pPr>
               <w:spacing w:line="276" w:lineRule="auto"/>
               <w:jc w:val="center"/>
-            </w:pPr>
-            <w:r>
+              <w:rPr>
+                <w:b/>
+                <w:bCs/>
+              </w:rPr>
+            </w:pPr>
+            <w:r>
+              <w:rPr>
+                <w:b/>
+                <w:bCs/>
+              </w:rPr>
               <w:t>S2 L1</w:t>
             </w:r>
           </w:p>
@@ -281,7 +319,13 @@
               <w:spacing w:line="276" w:lineRule="auto"/>
             </w:pPr>
             <w:r>
-              <w:t>Contributions vary from having one item or many items, and change to one can affect the reset of the collection</w:t>
+              <w:t>Contributions vary from having one item or many items, and change to one can affect the res</w:t>
+            </w:r>
+            <w:r>
+              <w:t>t</w:t>
+            </w:r>
+            <w:r>
+              <w:t xml:space="preserve"> of the collection</w:t>
             </w:r>
           </w:p>
         </w:tc>
@@ -295,8 +339,16 @@
             <w:pPr>
               <w:spacing w:line="276" w:lineRule="auto"/>
               <w:jc w:val="center"/>
-            </w:pPr>
-            <w:r>
+              <w:rPr>
+                <w:b/>
+                <w:bCs/>
+              </w:rPr>
+            </w:pPr>
+            <w:r>
+              <w:rPr>
+                <w:b/>
+                <w:bCs/>
+              </w:rPr>
               <w:t>S2 L2</w:t>
             </w:r>
           </w:p>
@@ -327,7 +379,22 @@
               <w:spacing w:line="276" w:lineRule="auto"/>
             </w:pPr>
             <w:r>
-              <w:t>Ownership and authority of material submitted is not always certain</w:t>
+              <w:t>The o</w:t>
+            </w:r>
+            <w:r>
+              <w:t>wnership and authority of</w:t>
+            </w:r>
+            <w:r>
+              <w:t xml:space="preserve"> submitted</w:t>
+            </w:r>
+            <w:r>
+              <w:t xml:space="preserve"> material </w:t>
+            </w:r>
+            <w:r>
+              <w:t>are</w:t>
+            </w:r>
+            <w:r>
+              <w:t xml:space="preserve"> not always certain</w:t>
             </w:r>
           </w:p>
         </w:tc>
@@ -341,8 +408,16 @@
             <w:pPr>
               <w:spacing w:line="276" w:lineRule="auto"/>
               <w:jc w:val="center"/>
-            </w:pPr>
-            <w:r>
+              <w:rPr>
+                <w:b/>
+                <w:bCs/>
+              </w:rPr>
+            </w:pPr>
+            <w:r>
+              <w:rPr>
+                <w:b/>
+                <w:bCs/>
+              </w:rPr>
               <w:lastRenderedPageBreak/>
               <w:t>S2 L3</w:t>
             </w:r>
@@ -374,7 +449,7 @@
               <w:spacing w:line="276" w:lineRule="auto"/>
             </w:pPr>
             <w:r>
-              <w:t>There is no single-entry point for requests and submissions may be incomplete. Staff must chase missing information rather than receive complete requests</w:t>
+              <w:t>Request arrive through several channels, so there is no single point of entry, and submissions may be incomplete. Staff must chase missing information rather than receive complete requests</w:t>
             </w:r>
           </w:p>
         </w:tc>
@@ -388,11 +463,23 @@
             <w:pPr>
               <w:spacing w:line="276" w:lineRule="auto"/>
               <w:jc w:val="center"/>
-            </w:pPr>
-            <w:r>
+              <w:rPr>
+                <w:b/>
+                <w:bCs/>
+              </w:rPr>
+            </w:pPr>
+            <w:r>
+              <w:rPr>
+                <w:b/>
+                <w:bCs/>
+              </w:rPr>
               <w:t xml:space="preserve">S2 </w:t>
             </w:r>
             <w:r>
+              <w:rPr>
+                <w:b/>
+                <w:bCs/>
+              </w:rPr>
               <w:t>L5</w:t>
             </w:r>
           </w:p>
@@ -420,7 +507,7 @@
               <w:spacing w:line="276" w:lineRule="auto"/>
             </w:pPr>
             <w:r>
-              <w:t>Decisions about which requests come first depends on who handles them. Requests in the same situation may receive different outcomes, which causes fairness and audit risks.</w:t>
+              <w:t>Decisions about which requests come first depend on who handles them. Requests in the same situation may receive different outcomes, which causes fairness and audit risks.</w:t>
             </w:r>
           </w:p>
         </w:tc>
@@ -434,11 +521,23 @@
             <w:pPr>
               <w:spacing w:line="276" w:lineRule="auto"/>
               <w:jc w:val="center"/>
-            </w:pPr>
-            <w:r>
+              <w:rPr>
+                <w:b/>
+                <w:bCs/>
+              </w:rPr>
+            </w:pPr>
+            <w:r>
+              <w:rPr>
+                <w:b/>
+                <w:bCs/>
+              </w:rPr>
               <w:t>S2 L</w:t>
             </w:r>
             <w:r>
+              <w:rPr>
+                <w:b/>
+                <w:bCs/>
+              </w:rPr>
               <w:t>6</w:t>
             </w:r>
           </w:p>
@@ -466,7 +565,13 @@
               <w:spacing w:line="276" w:lineRule="auto"/>
             </w:pPr>
             <w:r>
-              <w:t>Third parties can be involved with a request</w:t>
+              <w:t xml:space="preserve">Third parties can be involved </w:t>
+            </w:r>
+            <w:r>
+              <w:t xml:space="preserve">in </w:t>
+            </w:r>
+            <w:r>
+              <w:t>a request</w:t>
             </w:r>
           </w:p>
         </w:tc>
@@ -480,8 +585,16 @@
             <w:pPr>
               <w:spacing w:line="276" w:lineRule="auto"/>
               <w:jc w:val="center"/>
-            </w:pPr>
-            <w:r>
+              <w:rPr>
+                <w:b/>
+                <w:bCs/>
+              </w:rPr>
+            </w:pPr>
+            <w:r>
+              <w:rPr>
+                <w:b/>
+                <w:bCs/>
+              </w:rPr>
               <w:t>S2 L7</w:t>
             </w:r>
           </w:p>
@@ -520,7 +633,744 @@
               <w:spacing w:line="276" w:lineRule="auto"/>
             </w:pPr>
             <w:r>
-              <w:t>There’s uncertainty around staff in relation to authority over requests which introduces risks and delays</w:t>
+              <w:t>Staff are uncertain about their authority over requests, which creates risk and may cause delays</w:t>
+            </w:r>
+          </w:p>
+        </w:tc>
+      </w:tr>
+      <w:tr>
+        <w:tc>
+          <w:tcPr>
+            <w:tcW w:w="3005" w:type="dxa"/>
+          </w:tcPr>
+          <w:p>
+            <w:pPr>
+              <w:spacing w:line="276" w:lineRule="auto"/>
+              <w:jc w:val="center"/>
+              <w:rPr>
+                <w:b/>
+                <w:bCs/>
+              </w:rPr>
+            </w:pPr>
+            <w:r>
+              <w:rPr>
+                <w:b/>
+                <w:bCs/>
+              </w:rPr>
+              <w:t>S3 L1</w:t>
+            </w:r>
+          </w:p>
+        </w:tc>
+        <w:tc>
+          <w:tcPr>
+            <w:tcW w:w="3005" w:type="dxa"/>
+          </w:tcPr>
+          <w:p>
+            <w:pPr>
+              <w:spacing w:line="276" w:lineRule="auto"/>
+              <w:rPr>
+                <w:lang w:val="en-US"/>
+              </w:rPr>
+            </w:pPr>
+            <w:r>
+              <w:t>Review considers file quality, description, sensitivity, ownership evidence, access restrictions and relevance.</w:t>
+            </w:r>
+          </w:p>
+        </w:tc>
+        <w:tc>
+          <w:tcPr>
+            <w:tcW w:w="3006" w:type="dxa"/>
+            <w:vAlign w:val="center"/>
+          </w:tcPr>
+          <w:p>
+            <w:pPr>
+              <w:spacing w:line="276" w:lineRule="auto"/>
+            </w:pPr>
+            <w:r>
+              <w:t>Reviews consider multiple factors, so a request can fail on any one of them</w:t>
+            </w:r>
+          </w:p>
+        </w:tc>
+      </w:tr>
+      <w:tr>
+        <w:tc>
+          <w:tcPr>
+            <w:tcW w:w="3005" w:type="dxa"/>
+          </w:tcPr>
+          <w:p>
+            <w:pPr>
+              <w:spacing w:line="276" w:lineRule="auto"/>
+              <w:jc w:val="center"/>
+              <w:rPr>
+                <w:b/>
+                <w:bCs/>
+              </w:rPr>
+            </w:pPr>
+            <w:r>
+              <w:rPr>
+                <w:b/>
+                <w:bCs/>
+              </w:rPr>
+              <w:t>S3 L2</w:t>
+            </w:r>
+          </w:p>
+        </w:tc>
+        <w:tc>
+          <w:tcPr>
+            <w:tcW w:w="3005" w:type="dxa"/>
+          </w:tcPr>
+          <w:p>
+            <w:pPr>
+              <w:spacing w:line="276" w:lineRule="auto"/>
+              <w:rPr>
+                <w:lang w:val="en-US"/>
+              </w:rPr>
+            </w:pPr>
+            <w:r>
+              <w:rPr>
+                <w:lang w:val="en-US"/>
+              </w:rPr>
+              <w:t>An item can be preserved without being approved for public access.</w:t>
+            </w:r>
+          </w:p>
+          <w:p>
+            <w:pPr>
+              <w:spacing w:line="276" w:lineRule="auto"/>
+              <w:rPr>
+                <w:lang w:val="en-US"/>
+              </w:rPr>
+            </w:pPr>
+          </w:p>
+        </w:tc>
+        <w:tc>
+          <w:tcPr>
+            <w:tcW w:w="3006" w:type="dxa"/>
+            <w:vAlign w:val="center"/>
+          </w:tcPr>
+          <w:p>
+            <w:pPr>
+              <w:spacing w:line="276" w:lineRule="auto"/>
+            </w:pPr>
+            <w:r>
+              <w:t xml:space="preserve">Keeping an item and publishing it are separate outcomes. The system must be able to hold </w:t>
+            </w:r>
+            <w:r>
+              <w:lastRenderedPageBreak/>
+              <w:t>material that is not yet cleared for release</w:t>
+            </w:r>
+          </w:p>
+        </w:tc>
+      </w:tr>
+      <w:tr>
+        <w:tc>
+          <w:tcPr>
+            <w:tcW w:w="3005" w:type="dxa"/>
+          </w:tcPr>
+          <w:p>
+            <w:pPr>
+              <w:spacing w:line="276" w:lineRule="auto"/>
+              <w:jc w:val="center"/>
+              <w:rPr>
+                <w:b/>
+                <w:bCs/>
+              </w:rPr>
+            </w:pPr>
+            <w:r>
+              <w:rPr>
+                <w:b/>
+                <w:bCs/>
+              </w:rPr>
+              <w:lastRenderedPageBreak/>
+              <w:t>S3 L3</w:t>
+            </w:r>
+          </w:p>
+        </w:tc>
+        <w:tc>
+          <w:tcPr>
+            <w:tcW w:w="3005" w:type="dxa"/>
+          </w:tcPr>
+          <w:p>
+            <w:pPr>
+              <w:spacing w:line="276" w:lineRule="auto"/>
+              <w:rPr>
+                <w:lang w:val="en-US"/>
+              </w:rPr>
+            </w:pPr>
+            <w:r>
+              <w:t>Capacity depends on a combination of people, places, resources and timing.</w:t>
+            </w:r>
+          </w:p>
+        </w:tc>
+        <w:tc>
+          <w:tcPr>
+            <w:tcW w:w="3006" w:type="dxa"/>
+            <w:vAlign w:val="center"/>
+          </w:tcPr>
+          <w:p>
+            <w:pPr>
+              <w:spacing w:line="276" w:lineRule="auto"/>
+            </w:pPr>
+            <w:r>
+              <w:t xml:space="preserve">Capacity depends on several </w:t>
+            </w:r>
+            <w:r>
+              <w:t>factors,</w:t>
+            </w:r>
+            <w:r>
+              <w:t xml:space="preserve"> and available capacity is not a single number. A place can look free but still may be unusable because of staffing, recourses or timing</w:t>
+            </w:r>
+          </w:p>
+        </w:tc>
+      </w:tr>
+      <w:tr>
+        <w:tc>
+          <w:tcPr>
+            <w:tcW w:w="3005" w:type="dxa"/>
+          </w:tcPr>
+          <w:p>
+            <w:pPr>
+              <w:spacing w:line="276" w:lineRule="auto"/>
+              <w:jc w:val="center"/>
+              <w:rPr>
+                <w:b/>
+                <w:bCs/>
+              </w:rPr>
+            </w:pPr>
+            <w:r>
+              <w:rPr>
+                <w:b/>
+                <w:bCs/>
+              </w:rPr>
+              <w:t>S3 L4</w:t>
+            </w:r>
+          </w:p>
+        </w:tc>
+        <w:tc>
+          <w:tcPr>
+            <w:tcW w:w="3005" w:type="dxa"/>
+          </w:tcPr>
+          <w:p>
+            <w:pPr>
+              <w:spacing w:line="276" w:lineRule="auto"/>
+              <w:rPr>
+                <w:lang w:val="en-US"/>
+              </w:rPr>
+            </w:pPr>
+            <w:r>
+              <w:t>A visible vacancy does not necessarily mean that every requirement is satisfied</w:t>
+            </w:r>
+          </w:p>
+        </w:tc>
+        <w:tc>
+          <w:tcPr>
+            <w:tcW w:w="3006" w:type="dxa"/>
+            <w:vAlign w:val="center"/>
+          </w:tcPr>
+          <w:p>
+            <w:pPr>
+              <w:spacing w:line="276" w:lineRule="auto"/>
+            </w:pPr>
+            <w:r>
+              <w:t xml:space="preserve">A vacancy visible on screen cannot be used as a basis for allocation. The requirements must be checked separately </w:t>
+            </w:r>
+          </w:p>
+        </w:tc>
+      </w:tr>
+      <w:tr>
+        <w:tc>
+          <w:tcPr>
+            <w:tcW w:w="3005" w:type="dxa"/>
+          </w:tcPr>
+          <w:p>
+            <w:pPr>
+              <w:spacing w:line="276" w:lineRule="auto"/>
+              <w:jc w:val="center"/>
+              <w:rPr>
+                <w:b/>
+                <w:bCs/>
+              </w:rPr>
+            </w:pPr>
+            <w:r>
+              <w:rPr>
+                <w:b/>
+                <w:bCs/>
+              </w:rPr>
+              <w:t>S3 L5</w:t>
+            </w:r>
+          </w:p>
+        </w:tc>
+        <w:tc>
+          <w:tcPr>
+            <w:tcW w:w="3005" w:type="dxa"/>
+          </w:tcPr>
+          <w:p>
+            <w:pPr>
+              <w:spacing w:line="276" w:lineRule="auto"/>
+              <w:rPr>
+                <w:lang w:val="en-US"/>
+              </w:rPr>
+            </w:pPr>
+            <w:r>
+              <w:rPr>
+                <w:lang w:val="en-US"/>
+              </w:rPr>
+              <w:t>Provisional allocations sometimes remain in place while essential information is still missing.</w:t>
+            </w:r>
+          </w:p>
+        </w:tc>
+        <w:tc>
+          <w:tcPr>
+            <w:tcW w:w="3006" w:type="dxa"/>
+            <w:vAlign w:val="center"/>
+          </w:tcPr>
+          <w:p>
+            <w:pPr>
+              <w:spacing w:line="276" w:lineRule="auto"/>
+            </w:pPr>
+            <w:r>
+              <w:t>Places can be held for requests that are not ready, so capacity is tied up without progress. The frequency is not stated, so the scale o</w:t>
+            </w:r>
+            <w:r>
+              <w:t>f the problem is unknown</w:t>
+            </w:r>
+          </w:p>
+        </w:tc>
+      </w:tr>
+      <w:tr>
+        <w:tc>
+          <w:tcPr>
+            <w:tcW w:w="3005" w:type="dxa"/>
+          </w:tcPr>
+          <w:p>
+            <w:pPr>
+              <w:spacing w:line="276" w:lineRule="auto"/>
+              <w:jc w:val="center"/>
+              <w:rPr>
+                <w:b/>
+                <w:bCs/>
+              </w:rPr>
+            </w:pPr>
+            <w:r>
+              <w:rPr>
+                <w:b/>
+                <w:bCs/>
+              </w:rPr>
+              <w:t>S</w:t>
+            </w:r>
+            <w:r>
+              <w:rPr>
+                <w:b/>
+                <w:bCs/>
+              </w:rPr>
+              <w:t>3</w:t>
+            </w:r>
+            <w:r>
+              <w:rPr>
+                <w:b/>
+                <w:bCs/>
+              </w:rPr>
+              <w:t xml:space="preserve"> L6</w:t>
+            </w:r>
+          </w:p>
+        </w:tc>
+        <w:tc>
+          <w:tcPr>
+            <w:tcW w:w="3005" w:type="dxa"/>
+          </w:tcPr>
+          <w:p>
+            <w:pPr>
+              <w:spacing w:line="276" w:lineRule="auto"/>
+              <w:rPr>
+                <w:lang w:val="en-US"/>
+              </w:rPr>
+            </w:pPr>
+            <w:r>
+              <w:t>Changes can affect several linked arrangements.</w:t>
+            </w:r>
+          </w:p>
+        </w:tc>
+        <w:tc>
+          <w:tcPr>
+            <w:tcW w:w="3006" w:type="dxa"/>
+            <w:vAlign w:val="center"/>
+          </w:tcPr>
+          <w:p>
+            <w:pPr>
+              <w:spacing w:line="276" w:lineRule="auto"/>
+            </w:pPr>
+            <w:r>
+              <w:t>One change can have knock</w:t>
+            </w:r>
+            <w:r>
+              <w:t>-</w:t>
+            </w:r>
+            <w:r>
+              <w:t>on effects. Without any visible links between arrangements, a change may leave conflicting records behind</w:t>
+            </w:r>
+          </w:p>
+        </w:tc>
+      </w:tr>
+      <w:tr>
+        <w:tc>
+          <w:tcPr>
+            <w:tcW w:w="3005" w:type="dxa"/>
+          </w:tcPr>
+          <w:p>
+            <w:pPr>
+              <w:spacing w:line="276" w:lineRule="auto"/>
+              <w:jc w:val="center"/>
+              <w:rPr>
+                <w:b/>
+                <w:bCs/>
+              </w:rPr>
+            </w:pPr>
+            <w:r>
+              <w:rPr>
+                <w:b/>
+                <w:bCs/>
+              </w:rPr>
+              <w:t>S4 L1</w:t>
+            </w:r>
+          </w:p>
+        </w:tc>
+        <w:tc>
+          <w:tcPr>
+            <w:tcW w:w="3005" w:type="dxa"/>
+          </w:tcPr>
+          <w:p>
+            <w:pPr>
+              <w:spacing w:line="276" w:lineRule="auto"/>
+              <w:rPr>
+                <w:lang w:val="en-US"/>
+              </w:rPr>
+            </w:pPr>
+            <w:r>
+              <w:t>Staff record progress, decisions and outstanding actions using notes, messages and spreadsheets.</w:t>
+            </w:r>
+          </w:p>
+        </w:tc>
+        <w:tc>
+          <w:tcPr>
+            <w:tcW w:w="3006" w:type="dxa"/>
+            <w:vAlign w:val="center"/>
+          </w:tcPr>
+          <w:p>
+            <w:pPr>
+              <w:spacing w:line="276" w:lineRule="auto"/>
+            </w:pPr>
+            <w:r>
+              <w:t>Progress is recorded in notes, messages, and spreadsheets, with no clear authoritative record of where a request stands, making reporting unreliable</w:t>
+            </w:r>
+          </w:p>
+        </w:tc>
+      </w:tr>
+      <w:tr>
+        <w:tc>
+          <w:tcPr>
+            <w:tcW w:w="3005" w:type="dxa"/>
+          </w:tcPr>
+          <w:p>
+            <w:pPr>
+              <w:spacing w:line="276" w:lineRule="auto"/>
+              <w:jc w:val="center"/>
+              <w:rPr>
+                <w:b/>
+                <w:bCs/>
+              </w:rPr>
+            </w:pPr>
+            <w:r>
+              <w:rPr>
+                <w:b/>
+                <w:bCs/>
+              </w:rPr>
+              <w:lastRenderedPageBreak/>
+              <w:t>S4 L2</w:t>
+            </w:r>
+          </w:p>
+        </w:tc>
+        <w:tc>
+          <w:tcPr>
+            <w:tcW w:w="3005" w:type="dxa"/>
+          </w:tcPr>
+          <w:p>
+            <w:pPr>
+              <w:spacing w:line="276" w:lineRule="auto"/>
+              <w:rPr>
+                <w:lang w:val="en-US"/>
+              </w:rPr>
+            </w:pPr>
+            <w:r>
+              <w:t>Different teams use status terms differently, making it difficult to identify what is awaiting action and who is responsible.</w:t>
+            </w:r>
+          </w:p>
+        </w:tc>
+        <w:tc>
+          <w:tcPr>
+            <w:tcW w:w="3006" w:type="dxa"/>
+            <w:vAlign w:val="center"/>
+          </w:tcPr>
+          <w:p>
+            <w:pPr>
+              <w:spacing w:line="276" w:lineRule="auto"/>
+            </w:pPr>
+            <w:r>
+              <w:t xml:space="preserve">Status terms are not </w:t>
+            </w:r>
+            <w:r>
+              <w:t>standardized across teams. Accountability is also lost in this gap</w:t>
+            </w:r>
+          </w:p>
+        </w:tc>
+      </w:tr>
+      <w:tr>
+        <w:tc>
+          <w:tcPr>
+            <w:tcW w:w="3005" w:type="dxa"/>
+          </w:tcPr>
+          <w:p>
+            <w:pPr>
+              <w:spacing w:line="276" w:lineRule="auto"/>
+              <w:jc w:val="center"/>
+              <w:rPr>
+                <w:b/>
+                <w:bCs/>
+              </w:rPr>
+            </w:pPr>
+            <w:r>
+              <w:rPr>
+                <w:b/>
+                <w:bCs/>
+              </w:rPr>
+              <w:t>S4 L3</w:t>
+            </w:r>
+          </w:p>
+        </w:tc>
+        <w:tc>
+          <w:tcPr>
+            <w:tcW w:w="3005" w:type="dxa"/>
+          </w:tcPr>
+          <w:p>
+            <w:pPr>
+              <w:spacing w:line="276" w:lineRule="auto"/>
+              <w:rPr>
+                <w:lang w:val="en-US"/>
+              </w:rPr>
+            </w:pPr>
+            <w:r>
+              <w:t>A planned activity may be changed, partially completed, paused or withdrawn</w:t>
+            </w:r>
+          </w:p>
+        </w:tc>
+        <w:tc>
+          <w:tcPr>
+            <w:tcW w:w="3006" w:type="dxa"/>
+            <w:vAlign w:val="center"/>
+          </w:tcPr>
+          <w:p>
+            <w:pPr>
+              <w:spacing w:line="276" w:lineRule="auto"/>
+            </w:pPr>
+            <w:r>
+              <w:t xml:space="preserve">Planned activities can have different states. Each state needs to be recorded accurately, so the </w:t>
+            </w:r>
+            <w:r>
+              <w:t>record accurately shows what actually happened</w:t>
+            </w:r>
+          </w:p>
+        </w:tc>
+      </w:tr>
+      <w:tr>
+        <w:tc>
+          <w:tcPr>
+            <w:tcW w:w="3005" w:type="dxa"/>
+          </w:tcPr>
+          <w:p>
+            <w:pPr>
+              <w:spacing w:line="276" w:lineRule="auto"/>
+              <w:jc w:val="center"/>
+              <w:rPr>
+                <w:b/>
+                <w:bCs/>
+              </w:rPr>
+            </w:pPr>
+            <w:r>
+              <w:rPr>
+                <w:b/>
+                <w:bCs/>
+              </w:rPr>
+              <w:t>S4 L5</w:t>
+            </w:r>
+          </w:p>
+        </w:tc>
+        <w:tc>
+          <w:tcPr>
+            <w:tcW w:w="3005" w:type="dxa"/>
+          </w:tcPr>
+          <w:p>
+            <w:pPr>
+              <w:spacing w:line="276" w:lineRule="auto"/>
+              <w:rPr>
+                <w:lang w:val="en-US"/>
+              </w:rPr>
+            </w:pPr>
+            <w:r>
+              <w:t>Reviews may generate new actions, revised arrangements or escalation.</w:t>
+            </w:r>
+          </w:p>
+        </w:tc>
+        <w:tc>
+          <w:tcPr>
+            <w:tcW w:w="3006" w:type="dxa"/>
+            <w:vAlign w:val="center"/>
+          </w:tcPr>
+          <w:p>
+            <w:pPr>
+              <w:spacing w:line="276" w:lineRule="auto"/>
+            </w:pPr>
+            <w:r>
+              <w:t xml:space="preserve">A review does not necessarily </w:t>
+            </w:r>
+            <w:r>
+              <w:t>end a request.</w:t>
+            </w:r>
+            <w:r>
+              <w:t xml:space="preserve"> It can reopen the work, change earlier arrangements, or pass </w:t>
+            </w:r>
+            <w:r>
+              <w:t xml:space="preserve">the </w:t>
+            </w:r>
+            <w:r>
+              <w:t>matter to someone else</w:t>
+            </w:r>
+          </w:p>
+        </w:tc>
+      </w:tr>
+      <w:tr>
+        <w:tc>
+          <w:tcPr>
+            <w:tcW w:w="3005" w:type="dxa"/>
+          </w:tcPr>
+          <w:p>
+            <w:pPr>
+              <w:spacing w:line="276" w:lineRule="auto"/>
+              <w:jc w:val="center"/>
+              <w:rPr>
+                <w:b/>
+                <w:bCs/>
+              </w:rPr>
+            </w:pPr>
+            <w:r>
+              <w:rPr>
+                <w:b/>
+                <w:bCs/>
+              </w:rPr>
+              <w:t>S5 L4</w:t>
+            </w:r>
+          </w:p>
+        </w:tc>
+        <w:tc>
+          <w:tcPr>
+            <w:tcW w:w="3005" w:type="dxa"/>
+          </w:tcPr>
+          <w:p>
+            <w:pPr>
+              <w:spacing w:line="276" w:lineRule="auto"/>
+              <w:rPr>
+                <w:lang w:val="en-US"/>
+              </w:rPr>
+            </w:pPr>
+            <w:r>
+              <w:rPr>
+                <w:lang w:val="en-US"/>
+              </w:rPr>
+              <w:t>Connectivity may be unreliable during off-site work.</w:t>
+            </w:r>
+          </w:p>
+          <w:p>
+            <w:pPr>
+              <w:spacing w:line="276" w:lineRule="auto"/>
+              <w:rPr>
+                <w:lang w:val="en-US"/>
+              </w:rPr>
+            </w:pPr>
+          </w:p>
+        </w:tc>
+        <w:tc>
+          <w:tcPr>
+            <w:tcW w:w="3006" w:type="dxa"/>
+            <w:vAlign w:val="center"/>
+          </w:tcPr>
+          <w:p>
+            <w:pPr>
+              <w:spacing w:line="276" w:lineRule="auto"/>
+            </w:pPr>
+            <w:r>
+              <w:t>Staff may need to carry out some work off-site, where they may not have a reliable connection</w:t>
+            </w:r>
+          </w:p>
+        </w:tc>
+      </w:tr>
+      <w:tr>
+        <w:tc>
+          <w:tcPr>
+            <w:tcW w:w="3005" w:type="dxa"/>
+          </w:tcPr>
+          <w:p>
+            <w:pPr>
+              <w:spacing w:line="276" w:lineRule="auto"/>
+              <w:jc w:val="center"/>
+              <w:rPr>
+                <w:b/>
+                <w:bCs/>
+              </w:rPr>
+            </w:pPr>
+            <w:r>
+              <w:rPr>
+                <w:b/>
+                <w:bCs/>
+              </w:rPr>
+              <w:t>S6 L3</w:t>
+            </w:r>
+          </w:p>
+        </w:tc>
+        <w:tc>
+          <w:tcPr>
+            <w:tcW w:w="3005" w:type="dxa"/>
+          </w:tcPr>
+          <w:p>
+            <w:pPr>
+              <w:spacing w:line="276" w:lineRule="auto"/>
+              <w:rPr>
+                <w:lang w:val="en-US"/>
+              </w:rPr>
+            </w:pPr>
+            <w:r>
+              <w:rPr>
+                <w:lang w:val="en-US"/>
+              </w:rPr>
+              <w:t>Administrator: “Provisional arrangements can block capacity long after the original request has stalled.”</w:t>
+            </w:r>
+          </w:p>
+          <w:p>
+            <w:pPr>
+              <w:spacing w:line="276" w:lineRule="auto"/>
+              <w:rPr>
+                <w:lang w:val="en-US"/>
+              </w:rPr>
+            </w:pPr>
+          </w:p>
+        </w:tc>
+        <w:tc>
+          <w:tcPr>
+            <w:tcW w:w="3006" w:type="dxa"/>
+            <w:vAlign w:val="center"/>
+          </w:tcPr>
+          <w:p>
+            <w:pPr>
+              <w:spacing w:line="276" w:lineRule="auto"/>
+            </w:pPr>
+            <w:r>
+              <w:t>Some allocations are held without being released or confirmed, which reduces the number of places available for new allocations</w:t>
             </w:r>
           </w:p>
         </w:tc>

</xml_diff>